<commit_message>
Leistungsverzeichnis: Namen und E-Mail-Adresse entfernt
Personenbezogene Angaben gehören nicht in das öffentliche Repository.

Co-Authored-By: Claude Opus 5.5 <noreply@anthropic.com>
Claude-Session: https://claude.ai/code/session_01SjTSX7R9VDNJnLUkuJVonM
</commit_message>
<xml_diff>
--- a/docs/Leistungsverzeichnis_KOMPASS_Thueringen.docx
+++ b/docs/Leistungsverzeichnis_KOMPASS_Thueringen.docx
@@ -28,18 +28,6 @@
           <w:szCs w:val="26"/>
         </w:rPr>
         <w:t xml:space="preserve">Website-Relaunch KOMPASS Thüringen (WordPress → TYPO3)</w:t>
-      </w:r>
-    </w:p>
-    <w:p>
-      <w:pPr>
-        <w:spacing w:after="40"/>
-      </w:pPr>
-      <w:r>
-        <w:rPr>
-          <w:sz w:val="21"/>
-          <w:szCs w:val="21"/>
-        </w:rPr>
-        <w:t xml:space="preserve">Dominic Otto: dominic.otto@projektstadt.de</w:t>
       </w:r>
     </w:p>
     <w:p>

</xml_diff>